<commit_message>
chore: remove `demand` from Horizon Scanning entirely (user request)
`demand` was already gone from the headline IPM Horizon list; the only
remaining occurrence was in the Horizon "External environment"
subtheme, which feeds the report appendix + dashboard keyword table.
Removed it there too. Headline per-1000 figures and slide data are
unchanged (subthemes don't affect IPM scores); only the keyword
appendix/reference/keywords.json lose the `demand` row. Pipeline,
report, keyword reference, keywords.json, dashboard + both apps rebuilt.

Co-Authored-By: Claude Opus 4.7 (1M context) <noreply@anthropic.com>
</commit_message>
<xml_diff>
--- a/05_outputs/corporate_entrepreneurship_submission_ready_report.docx
+++ b/05_outputs/corporate_entrepreneurship_submission_ready_report.docx
@@ -14366,112 +14366,6 @@
               <w:spacing w:after="80"/>
             </w:pPr>
             <w:r>
-              <w:t xml:space="preserve">demand [demands, demanded, demanding]</w:t>
-            </w:r>
-          </w:p>
-        </w:tc>
-        <w:tc>
-          <w:tcPr>
-            <w:tcW w:w="2200" w:type="dxa"/>
-          </w:tcPr>
-          <w:p>
-            <w:pPr>
-              <w:spacing w:after="80"/>
-            </w:pPr>
-            <w:r>
-              <w:t xml:space="preserve">15</w:t>
-            </w:r>
-          </w:p>
-        </w:tc>
-        <w:tc>
-          <w:tcPr>
-            <w:tcW w:w="2200" w:type="dxa"/>
-          </w:tcPr>
-          <w:p>
-            <w:pPr>
-              <w:spacing w:after="80"/>
-            </w:pPr>
-            <w:r>
-              <w:t xml:space="preserve">13</w:t>
-            </w:r>
-          </w:p>
-        </w:tc>
-        <w:tc>
-          <w:tcPr>
-            <w:tcW w:w="2200" w:type="dxa"/>
-          </w:tcPr>
-          <w:p>
-            <w:pPr>
-              <w:spacing w:after="80"/>
-            </w:pPr>
-            <w:r>
-              <w:t xml:space="preserve">16</w:t>
-            </w:r>
-          </w:p>
-        </w:tc>
-        <w:tc>
-          <w:tcPr>
-            <w:tcW w:w="2200" w:type="dxa"/>
-          </w:tcPr>
-          <w:p>
-            <w:pPr>
-              <w:spacing w:after="80"/>
-            </w:pPr>
-            <w:r>
-              <w:t xml:space="preserve">31</w:t>
-            </w:r>
-          </w:p>
-        </w:tc>
-        <w:tc>
-          <w:tcPr>
-            <w:tcW w:w="2200" w:type="dxa"/>
-          </w:tcPr>
-          <w:p>
-            <w:pPr>
-              <w:spacing w:after="80"/>
-            </w:pPr>
-            <w:r>
-              <w:t xml:space="preserve">75</w:t>
-            </w:r>
-          </w:p>
-        </w:tc>
-      </w:tr>
-      <w:tr>
-        <w:tc>
-          <w:tcPr>
-            <w:tcW w:w="2200" w:type="dxa"/>
-          </w:tcPr>
-          <w:p>
-            <w:pPr>
-              <w:spacing w:after="80"/>
-            </w:pPr>
-            <w:r>
-              <w:t xml:space="preserve">Horizon Scanning / Sense-making</w:t>
-            </w:r>
-          </w:p>
-        </w:tc>
-        <w:tc>
-          <w:tcPr>
-            <w:tcW w:w="2200" w:type="dxa"/>
-          </w:tcPr>
-          <w:p>
-            <w:pPr>
-              <w:spacing w:after="80"/>
-            </w:pPr>
-            <w:r>
-              <w:t xml:space="preserve">External environment</w:t>
-            </w:r>
-          </w:p>
-        </w:tc>
-        <w:tc>
-          <w:tcPr>
-            <w:tcW w:w="2200" w:type="dxa"/>
-          </w:tcPr>
-          <w:p>
-            <w:pPr>
-              <w:spacing w:after="80"/>
-            </w:pPr>
-            <w:r>
               <w:t xml:space="preserve">commodity [commodities]</w:t>
             </w:r>
           </w:p>
@@ -35655,59 +35549,59 @@
               <w:spacing w:after="80"/>
             </w:pPr>
             <w:r>
-              <w:t xml:space="preserve">32</w:t>
-            </w:r>
-          </w:p>
-        </w:tc>
-        <w:tc>
-          <w:tcPr>
-            <w:tcW w:w="2200" w:type="dxa"/>
-          </w:tcPr>
-          <w:p>
-            <w:pPr>
-              <w:spacing w:after="80"/>
-            </w:pPr>
-            <w:r>
-              <w:t xml:space="preserve">19</w:t>
-            </w:r>
-          </w:p>
-        </w:tc>
-        <w:tc>
-          <w:tcPr>
-            <w:tcW w:w="2200" w:type="dxa"/>
-          </w:tcPr>
-          <w:p>
-            <w:pPr>
-              <w:spacing w:after="80"/>
-            </w:pPr>
-            <w:r>
-              <w:t xml:space="preserve">33</w:t>
-            </w:r>
-          </w:p>
-        </w:tc>
-        <w:tc>
-          <w:tcPr>
-            <w:tcW w:w="2200" w:type="dxa"/>
-          </w:tcPr>
-          <w:p>
-            <w:pPr>
-              <w:spacing w:after="80"/>
-            </w:pPr>
-            <w:r>
-              <w:t xml:space="preserve">44</w:t>
-            </w:r>
-          </w:p>
-        </w:tc>
-        <w:tc>
-          <w:tcPr>
-            <w:tcW w:w="2200" w:type="dxa"/>
-          </w:tcPr>
-          <w:p>
-            <w:pPr>
-              <w:spacing w:after="80"/>
-            </w:pPr>
-            <w:r>
-              <w:t xml:space="preserve">128</w:t>
+              <w:t xml:space="preserve">17</w:t>
+            </w:r>
+          </w:p>
+        </w:tc>
+        <w:tc>
+          <w:tcPr>
+            <w:tcW w:w="2200" w:type="dxa"/>
+          </w:tcPr>
+          <w:p>
+            <w:pPr>
+              <w:spacing w:after="80"/>
+            </w:pPr>
+            <w:r>
+              <w:t xml:space="preserve">6</w:t>
+            </w:r>
+          </w:p>
+        </w:tc>
+        <w:tc>
+          <w:tcPr>
+            <w:tcW w:w="2200" w:type="dxa"/>
+          </w:tcPr>
+          <w:p>
+            <w:pPr>
+              <w:spacing w:after="80"/>
+            </w:pPr>
+            <w:r>
+              <w:t xml:space="preserve">17</w:t>
+            </w:r>
+          </w:p>
+        </w:tc>
+        <w:tc>
+          <w:tcPr>
+            <w:tcW w:w="2200" w:type="dxa"/>
+          </w:tcPr>
+          <w:p>
+            <w:pPr>
+              <w:spacing w:after="80"/>
+            </w:pPr>
+            <w:r>
+              <w:t xml:space="preserve">13</w:t>
+            </w:r>
+          </w:p>
+        </w:tc>
+        <w:tc>
+          <w:tcPr>
+            <w:tcW w:w="2200" w:type="dxa"/>
+          </w:tcPr>
+          <w:p>
+            <w:pPr>
+              <w:spacing w:after="80"/>
+            </w:pPr>
+            <w:r>
+              <w:t xml:space="preserve">53</w:t>
             </w:r>
           </w:p>
         </w:tc>

</xml_diff>

<commit_message>
docs: add presentation + dashboard links to submission report
Surface the live companion materials (slide deck + analysis
command-center dashboard) as the first content under the title, ahead
of the Introduction, in both the PDF and DOCX. Regenerated both from
current lexicon (demand-free, latest horizon vocabulary).

Co-Authored-By: Claude Opus 4.7 (1M context) <noreply@anthropic.com>
</commit_message>
<xml_diff>
--- a/05_outputs/corporate_entrepreneurship_submission_ready_report.docx
+++ b/05_outputs/corporate_entrepreneurship_submission_ready_report.docx
@@ -26,6 +26,56 @@
           <w:szCs w:val="30"/>
         </w:rPr>
         <w:t xml:space="preserve">CEO/Shareholder Letter Analysis of Amazon, Nvidia, Shell, and Chevron</w:t>
+      </w:r>
+    </w:p>
+    <w:p/>
+    <w:p>
+      <w:pPr>
+        <w:spacing w:after="120"/>
+      </w:pPr>
+      <w:r>
+        <w:rPr>
+          <w:b/>
+          <w:sz w:val="20"/>
+          <w:szCs w:val="20"/>
+        </w:rPr>
+        <w:t xml:space="preserve">Interactive companion materials (live online):</w:t>
+      </w:r>
+    </w:p>
+    <w:p>
+      <w:pPr>
+        <w:spacing w:after="120"/>
+      </w:pPr>
+      <w:r>
+        <w:rPr>
+          <w:sz w:val="20"/>
+          <w:szCs w:val="20"/>
+        </w:rPr>
+        <w:t xml:space="preserve">Slide presentation (the talk):  https://bavlyremon.github.io/CorporateEntre/</w:t>
+      </w:r>
+    </w:p>
+    <w:p>
+      <w:pPr>
+        <w:spacing w:after="120"/>
+      </w:pPr>
+      <w:r>
+        <w:rPr>
+          <w:sz w:val="20"/>
+          <w:szCs w:val="20"/>
+        </w:rPr>
+        <w:t xml:space="preserve">Analysis command-center dashboard:  https://bavlyremon.github.io/CorporateEntre/dashboard/</w:t>
+      </w:r>
+    </w:p>
+    <w:p>
+      <w:pPr>
+        <w:spacing w:after="120"/>
+      </w:pPr>
+      <w:r>
+        <w:rPr>
+          <w:sz w:val="18"/>
+          <w:szCs w:val="18"/>
+        </w:rPr>
+        <w:t xml:space="preserve">The dashboard lets readers browse all 28 letters, the per-1,000 IPM theme rates, explore/exploit and customer/shareholder shares, the era matrices, and the full keyword dictionary behind every figure in this report.</w:t>
       </w:r>
     </w:p>
     <w:p/>

</xml_diff>